<commit_message>
Format B.Sc. thesis chapters 1-5 and proposal to comply with FUK guidelines (A4, 3.5cm left margin, block paragraphing)
</commit_message>
<xml_diff>
--- a/Academic_Proposal_Local_RAG_System.docx
+++ b/Academic_Proposal_Local_RAG_System.docx
@@ -587,8 +587,8 @@
       </w:r>
     </w:p>
     <w:sectPr>
-      <w:pgSz w:w="12240" w:h="15840"/>
-      <w:pgMar w:top="1440" w:right="1440" w:bottom="1440" w:left="1440" w:header="720" w:footer="720" w:gutter="0"/>
+      <w:pgSz w:w="11909" w:h="16834"/>
+      <w:pgMar w:top="1440" w:right="1440" w:bottom="1440" w:left="1987" w:header="720" w:footer="720" w:gutter="0"/>
       <w:cols w:space="720"/>
       <w:docGrid w:linePitch="360"/>
     </w:sectPr>

</xml_diff>